<commit_message>
Cruzador aprende del histórico: --diccionario con prioridad sobre el match difuso
Resultados de la calibración B-01 con junio real (197/198 filas
emparejadas; Transbank $34.931.863 y PAC $21.990.156 cuadrados al
peso): de 122 transferencias el match por nombre acertó 40, erró 26 y
no propuso 56. El patrón de los errores: terceros que pagan por el
socio (persona paga la cuota CE de su empresa) — imposible de resolver
por similitud de nombre.

Cambios: (1) nuevo --diccionario (CSV pagador→RUT que genera el
calibrador desde la preconciliación real) con prioridad y confianza
'alta'; (2) el match difuso queda como pista conservadora: nunca
'alta', requiere score >=0.75 y >=3 tokens comunes, bajo eso no
propone (mejor no proponer que proponer mal). Manual actualizado con
el ciclo de aprendizaje mensual. 12 tests.

Co-Authored-By: Claude Fable 5 <noreply@anthropic.com>
Claude-Session: https://claude.ai/code/session_0129TpKmEk9sKztPDUvqfnkU
</commit_message>
<xml_diff>
--- a/docs/automatizacion-puente/entregables-docx/Manual_Operacion_Automatizacion_Recaudacion_Cobranza_v1.1.docx
+++ b/docs/automatizacion-puente/entregables-docx/Manual_Operacion_Automatizacion_Recaudacion_Cobranza_v1.1.docx
@@ -2021,7 +2021,22 @@
         </w:numPr>
       </w:pPr>
       <w:r>
-        <w:t xml:space="preserve">Ejecutar:</w:t>
+        <w:t xml:space="preserve">Ejecutar (el</w:t>
+      </w:r>
+      <w:r>
+        <w:t xml:space="preserve"> </w:t>
+      </w:r>
+      <w:r>
+        <w:rPr>
+          <w:rStyle w:val="VerbatimChar"/>
+        </w:rPr>
+        <w:t xml:space="preserve">--diccionario</w:t>
+      </w:r>
+      <w:r>
+        <w:t xml:space="preserve"> </w:t>
+      </w:r>
+      <w:r>
+        <w:t xml:space="preserve">es el archivo aprendido del mes anterior — ver punto 6):</w:t>
       </w:r>
     </w:p>
     <w:p>
@@ -2201,6 +2216,33 @@
         <w:rPr>
           <w:rStyle w:val="AttributeTok"/>
         </w:rPr>
+        <w:t xml:space="preserve">--diccionario</w:t>
+      </w:r>
+      <w:r>
+        <w:rPr>
+          <w:rStyle w:val="NormalTok"/>
+        </w:rPr>
+        <w:t xml:space="preserve"> diccionario_nombre_rut.csv </w:t>
+      </w:r>
+      <w:r>
+        <w:rPr>
+          <w:rStyle w:val="DataTypeTok"/>
+        </w:rPr>
+        <w:t xml:space="preserve">\</w:t>
+      </w:r>
+      <w:r>
+        <w:br/>
+      </w:r>
+      <w:r>
+        <w:rPr>
+          <w:rStyle w:val="NormalTok"/>
+        </w:rPr>
+        <w:t xml:space="preserve">  </w:t>
+      </w:r>
+      <w:r>
+        <w:rPr>
+          <w:rStyle w:val="AttributeTok"/>
+        </w:rPr>
         <w:t xml:space="preserve">--salida</w:t>
       </w:r>
       <w:r>
@@ -2406,7 +2448,186 @@
         <w:t xml:space="preserve">Guardar como → .xlsx</w:t>
       </w:r>
       <w:r>
-        <w:t xml:space="preserve">, y reintentar con ese.</w:t>
+        <w:t xml:space="preserve">, y reintentar con ese (el cruzador también lee esos convertidos).</w:t>
+      </w:r>
+    </w:p>
+    <w:p>
+      <w:pPr>
+        <w:numPr>
+          <w:ilvl w:val="0"/>
+          <w:numId w:val="1007"/>
+        </w:numPr>
+      </w:pPr>
+      <w:r>
+        <w:rPr>
+          <w:bCs/>
+          <w:b/>
+        </w:rPr>
+        <w:t xml:space="preserve">El cruzador aprende mes a mes:</w:t>
+      </w:r>
+      <w:r>
+        <w:t xml:space="preserve"> </w:t>
+      </w:r>
+      <w:r>
+        <w:t xml:space="preserve">al terminar de conciliar el mes, correr</w:t>
+      </w:r>
+    </w:p>
+    <w:p>
+      <w:pPr>
+        <w:numPr>
+          <w:ilvl w:val="0"/>
+          <w:numId w:val="1000"/>
+        </w:numPr>
+        <w:pStyle w:val="SourceCode"/>
+      </w:pPr>
+      <w:r>
+        <w:rPr>
+          <w:rStyle w:val="ExtensionTok"/>
+        </w:rPr>
+        <w:t xml:space="preserve">python3</w:t>
+      </w:r>
+      <w:r>
+        <w:rPr>
+          <w:rStyle w:val="NormalTok"/>
+        </w:rPr>
+        <w:t xml:space="preserve"> calibrar_preconciliacion.py </w:t>
+      </w:r>
+      <w:r>
+        <w:rPr>
+          <w:rStyle w:val="AttributeTok"/>
+        </w:rPr>
+        <w:t xml:space="preserve">--real</w:t>
+      </w:r>
+      <w:r>
+        <w:rPr>
+          <w:rStyle w:val="NormalTok"/>
+        </w:rPr>
+        <w:t xml:space="preserve"> </w:t>
+      </w:r>
+      <w:r>
+        <w:rPr>
+          <w:rStyle w:val="StringTok"/>
+        </w:rPr>
+        <w:t xml:space="preserve">"NN PRECONCILIACIÓN MES 26.xlsx"</w:t>
+      </w:r>
+      <w:r>
+        <w:rPr>
+          <w:rStyle w:val="NormalTok"/>
+        </w:rPr>
+        <w:t xml:space="preserve"> </w:t>
+      </w:r>
+      <w:r>
+        <w:rPr>
+          <w:rStyle w:val="AttributeTok"/>
+        </w:rPr>
+        <w:t xml:space="preserve">--borrador</w:t>
+      </w:r>
+      <w:r>
+        <w:rPr>
+          <w:rStyle w:val="NormalTok"/>
+        </w:rPr>
+        <w:t xml:space="preserve"> PRECONCILIACION_BORRADOR.xlsx </w:t>
+      </w:r>
+      <w:r>
+        <w:rPr>
+          <w:rStyle w:val="AttributeTok"/>
+        </w:rPr>
+        <w:t xml:space="preserve">--salida</w:t>
+      </w:r>
+      <w:r>
+        <w:rPr>
+          <w:rStyle w:val="NormalTok"/>
+        </w:rPr>
+        <w:t xml:space="preserve"> .</w:t>
+      </w:r>
+    </w:p>
+    <w:p>
+      <w:pPr>
+        <w:numPr>
+          <w:ilvl w:val="0"/>
+          <w:numId w:val="1000"/>
+        </w:numPr>
+      </w:pPr>
+      <w:r>
+        <w:t xml:space="preserve">Eso mide cuánto acertó el borrador y</w:t>
+      </w:r>
+      <w:r>
+        <w:t xml:space="preserve"> </w:t>
+      </w:r>
+      <w:r>
+        <w:rPr>
+          <w:bCs/>
+          <w:b/>
+        </w:rPr>
+        <w:t xml:space="preserve">actualiza</w:t>
+      </w:r>
+      <w:r>
+        <w:rPr>
+          <w:bCs/>
+          <w:b/>
+        </w:rPr>
+        <w:t xml:space="preserve"> </w:t>
+      </w:r>
+      <w:r>
+        <w:rPr>
+          <w:rStyle w:val="VerbatimChar"/>
+          <w:bCs/>
+          <w:b/>
+        </w:rPr>
+        <w:t xml:space="preserve">diccionario_nombre_rut.csv</w:t>
+      </w:r>
+      <w:r>
+        <w:t xml:space="preserve"> </w:t>
+      </w:r>
+      <w:r>
+        <w:t xml:space="preserve">(los pares pagador→socio que el equipo resolvió a mano). Ese archivo se pasa con</w:t>
+      </w:r>
+      <w:r>
+        <w:t xml:space="preserve"> </w:t>
+      </w:r>
+      <w:r>
+        <w:rPr>
+          <w:rStyle w:val="VerbatimChar"/>
+        </w:rPr>
+        <w:t xml:space="preserve">--diccionario</w:t>
+      </w:r>
+      <w:r>
+        <w:t xml:space="preserve"> </w:t>
+      </w:r>
+      <w:r>
+        <w:t xml:space="preserve">al mes siguiente: es lo único que identifica los pagos hechos por terceros (una persona que paga la cuota de su empresa). Confianza</w:t>
+      </w:r>
+      <w:r>
+        <w:t xml:space="preserve"> </w:t>
+      </w:r>
+      <w:r>
+        <w:rPr>
+          <w:bCs/>
+          <w:b/>
+        </w:rPr>
+        <w:t xml:space="preserve">alta</w:t>
+      </w:r>
+      <w:r>
+        <w:t xml:space="preserve"> </w:t>
+      </w:r>
+      <w:r>
+        <w:t xml:space="preserve">= identificado por histórico;</w:t>
+      </w:r>
+      <w:r>
+        <w:t xml:space="preserve"> </w:t>
+      </w:r>
+      <w:r>
+        <w:rPr>
+          <w:bCs/>
+          <w:b/>
+        </w:rPr>
+        <w:t xml:space="preserve">media</w:t>
+      </w:r>
+      <w:r>
+        <w:t xml:space="preserve"> </w:t>
+      </w:r>
+      <w:r>
+        <w:t xml:space="preserve">= parecido de nombre, siempre confirmar contra la deuda.</w:t>
       </w:r>
     </w:p>
     <w:bookmarkEnd w:id="24"/>

</xml_diff>